<commit_message>
Add Assignment02 execution screenshots
</commit_message>
<xml_diff>
--- a/Assignment02/Assignment02_Report.docx
+++ b/Assignment02/Assignment02_Report.docx
@@ -1099,10 +1099,9 @@
             <w:r>
               <w:rPr>
                 <w:rFonts w:ascii="Calibri" w:hAnsi="Calibri"/>
-                <w:b w:val="0"/>
                 <w:sz w:val="21"/>
               </w:rPr>
-              <w:t>11860750 ns (11.861 ms)</w:t>
+              <w:t>3373125 ns (3.373 ms)</w:t>
             </w:r>
           </w:p>
         </w:tc>
@@ -1126,10 +1125,9 @@
             <w:r>
               <w:rPr>
                 <w:rFonts w:ascii="Calibri" w:hAnsi="Calibri"/>
-                <w:b w:val="0"/>
                 <w:sz w:val="21"/>
               </w:rPr>
-              <w:t>6890833 ns (6.891 ms)</w:t>
+              <w:t>6647625 ns (6.648 ms)</w:t>
             </w:r>
           </w:p>
         </w:tc>
@@ -1196,7 +1194,7 @@
       </w:tblGrid>
       <w:tr>
         <w:trPr>
-          <w:trHeight w:val="8928" w:hRule="atLeast"/>
+          <w:trHeight w:val="8136" w:hRule="atLeast"/>
         </w:trPr>
         <w:tc>
           <w:tcPr>
@@ -1222,13 +1220,38 @@
               <w:jc w:val="center"/>
             </w:pPr>
             <w:r>
-              <w:rPr>
-                <w:rFonts w:ascii="Calibri" w:hAnsi="Calibri"/>
-                <w:b/>
-                <w:color w:val="2E74B5"/>
-                <w:sz w:val="24"/>
-              </w:rPr>
-              <w:t>PROGRAM OUTPUT SCREENSHOT: GREEDY SOLUTION</w:t>
+              <w:drawing>
+                <wp:inline xmlns:a="http://schemas.openxmlformats.org/drawingml/2006/main" xmlns:pic="http://schemas.openxmlformats.org/drawingml/2006/picture">
+                  <wp:extent cx="5532120" cy="4642662"/>
+                  <wp:docPr id="2" name="Picture 2"/>
+                  <wp:cNvGraphicFramePr>
+                    <a:graphicFrameLocks noChangeAspect="1"/>
+                  </wp:cNvGraphicFramePr>
+                  <a:graphic>
+                    <a:graphicData uri="http://schemas.openxmlformats.org/drawingml/2006/picture">
+                      <pic:pic>
+                        <pic:nvPicPr>
+                          <pic:cNvPr id="0" name="Screenshot 2026-06-18 at 11.20.26.png"/>
+                          <pic:cNvPicPr/>
+                        </pic:nvPicPr>
+                        <pic:blipFill>
+                          <a:blip r:embed="rId10"/>
+                          <a:stretch>
+                            <a:fillRect/>
+                          </a:stretch>
+                        </pic:blipFill>
+                        <pic:spPr>
+                          <a:xfrm>
+                            <a:off x="0" y="0"/>
+                            <a:ext cx="5532120" cy="4642662"/>
+                          </a:xfrm>
+                          <a:prstGeom prst="rect"/>
+                        </pic:spPr>
+                      </pic:pic>
+                    </a:graphicData>
+                  </a:graphic>
+                </wp:inline>
+              </w:drawing>
             </w:r>
           </w:p>
           <w:p>
@@ -1240,10 +1263,9 @@
               <w:rPr>
                 <w:rFonts w:ascii="Calibri" w:hAnsi="Calibri"/>
                 <w:i/>
-                <w:color w:val="595959"/>
-                <w:sz w:val="20"/>
+                <w:sz w:val="18"/>
               </w:rPr>
-              <w:t>Delete this placeholder text and insert the corresponding screenshot here.</w:t>
+              <w:t>Figure: Greedy algorithm selected items and final totals (3977g, worth 721).</w:t>
             </w:r>
           </w:p>
         </w:tc>
@@ -1279,7 +1301,7 @@
       </w:tblGrid>
       <w:tr>
         <w:trPr>
-          <w:trHeight w:val="8928" w:hRule="atLeast"/>
+          <w:trHeight w:val="8136" w:hRule="atLeast"/>
         </w:trPr>
         <w:tc>
           <w:tcPr>
@@ -1305,13 +1327,38 @@
               <w:jc w:val="center"/>
             </w:pPr>
             <w:r>
-              <w:rPr>
-                <w:rFonts w:ascii="Calibri" w:hAnsi="Calibri"/>
-                <w:b/>
-                <w:color w:val="2E74B5"/>
-                <w:sz w:val="24"/>
-              </w:rPr>
-              <w:t>PROGRAM OUTPUT SCREENSHOT: DYNAMIC PROGRAMMING SOLUTION</w:t>
+              <w:drawing>
+                <wp:inline xmlns:a="http://schemas.openxmlformats.org/drawingml/2006/main" xmlns:pic="http://schemas.openxmlformats.org/drawingml/2006/picture">
+                  <wp:extent cx="5532120" cy="4553754"/>
+                  <wp:docPr id="3" name="Picture 3"/>
+                  <wp:cNvGraphicFramePr>
+                    <a:graphicFrameLocks noChangeAspect="1"/>
+                  </wp:cNvGraphicFramePr>
+                  <a:graphic>
+                    <a:graphicData uri="http://schemas.openxmlformats.org/drawingml/2006/picture">
+                      <pic:pic>
+                        <pic:nvPicPr>
+                          <pic:cNvPr id="0" name="Screenshot 2026-06-18 at 11.20.34.png"/>
+                          <pic:cNvPicPr/>
+                        </pic:nvPicPr>
+                        <pic:blipFill>
+                          <a:blip r:embed="rId11"/>
+                          <a:stretch>
+                            <a:fillRect/>
+                          </a:stretch>
+                        </pic:blipFill>
+                        <pic:spPr>
+                          <a:xfrm>
+                            <a:off x="0" y="0"/>
+                            <a:ext cx="5532120" cy="4553754"/>
+                          </a:xfrm>
+                          <a:prstGeom prst="rect"/>
+                        </pic:spPr>
+                      </pic:pic>
+                    </a:graphicData>
+                  </a:graphic>
+                </wp:inline>
+              </w:drawing>
             </w:r>
           </w:p>
           <w:p>
@@ -1323,15 +1370,86 @@
               <w:rPr>
                 <w:rFonts w:ascii="Calibri" w:hAnsi="Calibri"/>
                 <w:i/>
-                <w:color w:val="595959"/>
-                <w:sz w:val="20"/>
+                <w:sz w:val="18"/>
               </w:rPr>
-              <w:t>Delete this placeholder text and insert the corresponding screenshot here.</w:t>
+              <w:t>Figure: Dynamic programming selected items and optimal totals (3995g, worth 722).</w:t>
             </w:r>
           </w:p>
         </w:tc>
       </w:tr>
     </w:tbl>
+    <w:p>
+      <w:pPr>
+        <w:spacing w:after="0"/>
+      </w:pPr>
+      <w:r>
+        <w:br w:type="page"/>
+      </w:r>
+    </w:p>
+    <w:p>
+      <w:pPr>
+        <w:pStyle w:val="4"/>
+        <w:keepNext/>
+        <w:spacing w:after="120"/>
+      </w:pPr>
+      <w:r>
+        <w:t>Execution Completion Evidence</w:t>
+      </w:r>
+    </w:p>
+    <w:p>
+      <w:pPr>
+        <w:spacing w:after="80"/>
+        <w:jc w:val="center"/>
+      </w:pPr>
+      <w:r>
+        <w:drawing>
+          <wp:inline xmlns:a="http://schemas.openxmlformats.org/drawingml/2006/main" xmlns:pic="http://schemas.openxmlformats.org/drawingml/2006/picture">
+            <wp:extent cx="5715000" cy="3699711"/>
+            <wp:docPr id="4" name="Picture 4"/>
+            <wp:cNvGraphicFramePr>
+              <a:graphicFrameLocks noChangeAspect="1"/>
+            </wp:cNvGraphicFramePr>
+            <a:graphic>
+              <a:graphicData uri="http://schemas.openxmlformats.org/drawingml/2006/picture">
+                <pic:pic>
+                  <pic:nvPicPr>
+                    <pic:cNvPr id="0" name="Screenshot 2026-06-18 at 11.13.26.png"/>
+                    <pic:cNvPicPr/>
+                  </pic:nvPicPr>
+                  <pic:blipFill>
+                    <a:blip r:embed="rId12"/>
+                    <a:stretch>
+                      <a:fillRect/>
+                    </a:stretch>
+                  </pic:blipFill>
+                  <pic:spPr>
+                    <a:xfrm>
+                      <a:off x="0" y="0"/>
+                      <a:ext cx="5715000" cy="3699711"/>
+                    </a:xfrm>
+                    <a:prstGeom prst="rect"/>
+                  </pic:spPr>
+                </pic:pic>
+              </a:graphicData>
+            </a:graphic>
+          </wp:inline>
+        </w:drawing>
+      </w:r>
+    </w:p>
+    <w:p>
+      <w:pPr>
+        <w:spacing w:after="0"/>
+        <w:jc w:val="center"/>
+      </w:pPr>
+      <w:r>
+        <w:rPr>
+          <w:rFonts w:ascii="Calibri" w:hAnsi="Calibri"/>
+          <w:i/>
+          <w:sz w:val="18"/>
+        </w:rPr>
+        <w:t>Figure: Main.java executed successfully in IntelliJ IDEA; comparison_table.txt was generated and the process finished with exit code 0.</w:t>
+      </w:r>
+    </w:p>
     <w:p>
       <w:pPr>
         <w:spacing w:after="0"/>

</xml_diff>

<commit_message>
Finalize Assignment02 source code section
</commit_message>
<xml_diff>
--- a/Assignment02/Assignment02_Report.docx
+++ b/Assignment02/Assignment02_Report.docx
@@ -1567,407 +1567,23 @@
       </w:r>
     </w:p>
     <w:p>
+      <w:pPr>
+        <w:pStyle w:val="2"/>
+        <w:keepNext/>
+        <w:spacing w:before="320" w:after="160"/>
+      </w:pPr>
       <w:r>
-        <w:br w:type="page"/>
+        <w:t>8. Source Code Files</w:t>
       </w:r>
     </w:p>
     <w:p>
       <w:pPr>
-        <w:pStyle w:val="2"/>
-        <w:keepNext/>
+        <w:spacing w:after="120"/>
       </w:pPr>
       <w:r>
-        <w:t>8. Source Code Evidence</w:t>
+        <w:t>The complete Java source code is included in the submission ZIP file under the src folder. The folder contains Item.java, GreedyKnapsack.java, DynamicProgrammingKnapsack.java, and Main.java.</w:t>
       </w:r>
     </w:p>
-    <w:p>
-      <w:pPr>
-        <w:spacing w:after="200"/>
-      </w:pPr>
-      <w:r>
-        <w:t>Insert clear screenshots of the complete Java source files below. Ensure that file names, class declarations, algorithm logic, and important methods are readable.</w:t>
-      </w:r>
-    </w:p>
-    <w:p>
-      <w:pPr>
-        <w:pStyle w:val="3"/>
-        <w:keepNext/>
-      </w:pPr>
-      <w:r>
-        <w:t>8.1 Item.java</w:t>
-      </w:r>
-    </w:p>
-    <w:tbl>
-      <w:tblPr>
-        <w:tblW w:type="auto" w:w="0"/>
-        <w:jc w:val="center"/>
-        <w:tblLayout w:type="fixed"/>
-        <w:tblLook w:firstColumn="1" w:firstRow="1" w:lastColumn="0" w:lastRow="0" w:noHBand="0" w:noVBand="1" w:val="04A0"/>
-      </w:tblPr>
-      <w:tblGrid>
-        <w:gridCol w:w="9144"/>
-      </w:tblGrid>
-      <w:tr>
-        <w:trPr>
-          <w:trHeight w:val="8640" w:hRule="atLeast"/>
-        </w:trPr>
-        <w:tc>
-          <w:tcPr>
-            <w:tcW w:type="dxa" w:w="9144"/>
-            <w:vAlign w:val="center"/>
-            <w:tcMar>
-              <w:top w:w="140" w:type="dxa"/>
-              <w:start w:w="180" w:type="dxa"/>
-              <w:bottom w:w="140" w:type="dxa"/>
-              <w:end w:w="180" w:type="dxa"/>
-            </w:tcMar>
-            <w:shd w:fill="F7F9FC"/>
-            <w:tcBorders>
-              <w:top w:val="dashed" w:sz="10" w:space="0" w:color="9FBAD0"/>
-              <w:left w:val="dashed" w:sz="10" w:space="0" w:color="9FBAD0"/>
-              <w:bottom w:val="dashed" w:sz="10" w:space="0" w:color="9FBAD0"/>
-              <w:right w:val="dashed" w:sz="10" w:space="0" w:color="9FBAD0"/>
-            </w:tcBorders>
-          </w:tcPr>
-          <w:p>
-            <w:pPr>
-              <w:jc w:val="center"/>
-            </w:pPr>
-            <w:r>
-              <w:rPr>
-                <w:rFonts w:ascii="Calibri" w:hAnsi="Calibri"/>
-                <w:b/>
-                <w:color w:val="2E74B5"/>
-                <w:sz w:val="24"/>
-              </w:rPr>
-              <w:t>SOURCE CODE SCREENSHOT: Item.java</w:t>
-            </w:r>
-          </w:p>
-          <w:p>
-            <w:pPr>
-              <w:jc w:val="center"/>
-            </w:pPr>
-            <w:r>
-              <w:rPr>
-                <w:rFonts w:ascii="Calibri" w:hAnsi="Calibri"/>
-                <w:i/>
-                <w:color w:val="595959"/>
-                <w:sz w:val="20"/>
-              </w:rPr>
-              <w:t>Delete this placeholder text and insert the corresponding screenshot here.</w:t>
-            </w:r>
-          </w:p>
-        </w:tc>
-      </w:tr>
-    </w:tbl>
-    <w:p>
-      <w:r>
-        <w:br w:type="page"/>
-      </w:r>
-    </w:p>
-    <w:p>
-      <w:pPr>
-        <w:pStyle w:val="3"/>
-        <w:keepNext/>
-      </w:pPr>
-      <w:r>
-        <w:t>8.2 GreedyKnapsack.java</w:t>
-      </w:r>
-    </w:p>
-    <w:tbl>
-      <w:tblPr>
-        <w:tblW w:type="auto" w:w="0"/>
-        <w:jc w:val="center"/>
-        <w:tblLayout w:type="fixed"/>
-        <w:tblLook w:firstColumn="1" w:firstRow="1" w:lastColumn="0" w:lastRow="0" w:noHBand="0" w:noVBand="1" w:val="04A0"/>
-      </w:tblPr>
-      <w:tblGrid>
-        <w:gridCol w:w="9144"/>
-      </w:tblGrid>
-      <w:tr>
-        <w:trPr>
-          <w:trHeight w:val="8640" w:hRule="atLeast"/>
-        </w:trPr>
-        <w:tc>
-          <w:tcPr>
-            <w:tcW w:type="dxa" w:w="9144"/>
-            <w:vAlign w:val="center"/>
-            <w:tcMar>
-              <w:top w:w="140" w:type="dxa"/>
-              <w:start w:w="180" w:type="dxa"/>
-              <w:bottom w:w="140" w:type="dxa"/>
-              <w:end w:w="180" w:type="dxa"/>
-            </w:tcMar>
-            <w:shd w:fill="F7F9FC"/>
-            <w:tcBorders>
-              <w:top w:val="dashed" w:sz="10" w:space="0" w:color="9FBAD0"/>
-              <w:left w:val="dashed" w:sz="10" w:space="0" w:color="9FBAD0"/>
-              <w:bottom w:val="dashed" w:sz="10" w:space="0" w:color="9FBAD0"/>
-              <w:right w:val="dashed" w:sz="10" w:space="0" w:color="9FBAD0"/>
-            </w:tcBorders>
-          </w:tcPr>
-          <w:p>
-            <w:pPr>
-              <w:jc w:val="center"/>
-            </w:pPr>
-            <w:r>
-              <w:rPr>
-                <w:rFonts w:ascii="Calibri" w:hAnsi="Calibri"/>
-                <w:b/>
-                <w:color w:val="2E74B5"/>
-                <w:sz w:val="24"/>
-              </w:rPr>
-              <w:t>SOURCE CODE SCREENSHOT: GreedyKnapsack.java</w:t>
-            </w:r>
-          </w:p>
-          <w:p>
-            <w:pPr>
-              <w:jc w:val="center"/>
-            </w:pPr>
-            <w:r>
-              <w:rPr>
-                <w:rFonts w:ascii="Calibri" w:hAnsi="Calibri"/>
-                <w:i/>
-                <w:color w:val="595959"/>
-                <w:sz w:val="20"/>
-              </w:rPr>
-              <w:t>Delete this placeholder text and insert the corresponding screenshot here.</w:t>
-            </w:r>
-          </w:p>
-        </w:tc>
-      </w:tr>
-    </w:tbl>
-    <w:p>
-      <w:r>
-        <w:br w:type="page"/>
-      </w:r>
-    </w:p>
-    <w:p>
-      <w:pPr>
-        <w:pStyle w:val="3"/>
-        <w:keepNext/>
-      </w:pPr>
-      <w:r>
-        <w:t>8.3 DynamicProgrammingKnapsack.java</w:t>
-      </w:r>
-    </w:p>
-    <w:tbl>
-      <w:tblPr>
-        <w:tblW w:type="auto" w:w="0"/>
-        <w:jc w:val="center"/>
-        <w:tblLayout w:type="fixed"/>
-        <w:tblLook w:firstColumn="1" w:firstRow="1" w:lastColumn="0" w:lastRow="0" w:noHBand="0" w:noVBand="1" w:val="04A0"/>
-      </w:tblPr>
-      <w:tblGrid>
-        <w:gridCol w:w="9144"/>
-      </w:tblGrid>
-      <w:tr>
-        <w:trPr>
-          <w:trHeight w:val="8640" w:hRule="atLeast"/>
-        </w:trPr>
-        <w:tc>
-          <w:tcPr>
-            <w:tcW w:type="dxa" w:w="9144"/>
-            <w:vAlign w:val="center"/>
-            <w:tcMar>
-              <w:top w:w="140" w:type="dxa"/>
-              <w:start w:w="180" w:type="dxa"/>
-              <w:bottom w:w="140" w:type="dxa"/>
-              <w:end w:w="180" w:type="dxa"/>
-            </w:tcMar>
-            <w:shd w:fill="F7F9FC"/>
-            <w:tcBorders>
-              <w:top w:val="dashed" w:sz="10" w:space="0" w:color="9FBAD0"/>
-              <w:left w:val="dashed" w:sz="10" w:space="0" w:color="9FBAD0"/>
-              <w:bottom w:val="dashed" w:sz="10" w:space="0" w:color="9FBAD0"/>
-              <w:right w:val="dashed" w:sz="10" w:space="0" w:color="9FBAD0"/>
-            </w:tcBorders>
-          </w:tcPr>
-          <w:p>
-            <w:pPr>
-              <w:jc w:val="center"/>
-            </w:pPr>
-            <w:r>
-              <w:rPr>
-                <w:rFonts w:ascii="Calibri" w:hAnsi="Calibri"/>
-                <w:b/>
-                <w:color w:val="2E74B5"/>
-                <w:sz w:val="24"/>
-              </w:rPr>
-              <w:t>SOURCE CODE SCREENSHOT: DynamicProgrammingKnapsack.java</w:t>
-            </w:r>
-          </w:p>
-          <w:p>
-            <w:pPr>
-              <w:jc w:val="center"/>
-            </w:pPr>
-            <w:r>
-              <w:rPr>
-                <w:rFonts w:ascii="Calibri" w:hAnsi="Calibri"/>
-                <w:i/>
-                <w:color w:val="595959"/>
-                <w:sz w:val="20"/>
-              </w:rPr>
-              <w:t>Delete this placeholder text and insert the corresponding screenshot here.</w:t>
-            </w:r>
-          </w:p>
-        </w:tc>
-      </w:tr>
-    </w:tbl>
-    <w:p>
-      <w:r>
-        <w:br w:type="page"/>
-      </w:r>
-    </w:p>
-    <w:p>
-      <w:pPr>
-        <w:pStyle w:val="3"/>
-        <w:keepNext/>
-      </w:pPr>
-      <w:r>
-        <w:t>8.4 Main.java (Part 1)</w:t>
-      </w:r>
-    </w:p>
-    <w:tbl>
-      <w:tblPr>
-        <w:tblW w:type="auto" w:w="0"/>
-        <w:jc w:val="center"/>
-        <w:tblLayout w:type="fixed"/>
-        <w:tblLook w:firstColumn="1" w:firstRow="1" w:lastColumn="0" w:lastRow="0" w:noHBand="0" w:noVBand="1" w:val="04A0"/>
-      </w:tblPr>
-      <w:tblGrid>
-        <w:gridCol w:w="9144"/>
-      </w:tblGrid>
-      <w:tr>
-        <w:trPr>
-          <w:trHeight w:val="8640" w:hRule="atLeast"/>
-        </w:trPr>
-        <w:tc>
-          <w:tcPr>
-            <w:tcW w:type="dxa" w:w="9144"/>
-            <w:vAlign w:val="center"/>
-            <w:tcMar>
-              <w:top w:w="140" w:type="dxa"/>
-              <w:start w:w="180" w:type="dxa"/>
-              <w:bottom w:w="140" w:type="dxa"/>
-              <w:end w:w="180" w:type="dxa"/>
-            </w:tcMar>
-            <w:shd w:fill="F7F9FC"/>
-            <w:tcBorders>
-              <w:top w:val="dashed" w:sz="10" w:space="0" w:color="9FBAD0"/>
-              <w:left w:val="dashed" w:sz="10" w:space="0" w:color="9FBAD0"/>
-              <w:bottom w:val="dashed" w:sz="10" w:space="0" w:color="9FBAD0"/>
-              <w:right w:val="dashed" w:sz="10" w:space="0" w:color="9FBAD0"/>
-            </w:tcBorders>
-          </w:tcPr>
-          <w:p>
-            <w:pPr>
-              <w:jc w:val="center"/>
-            </w:pPr>
-            <w:r>
-              <w:rPr>
-                <w:rFonts w:ascii="Calibri" w:hAnsi="Calibri"/>
-                <w:b/>
-                <w:color w:val="2E74B5"/>
-                <w:sz w:val="24"/>
-              </w:rPr>
-              <w:t>SOURCE CODE SCREENSHOT: Main.java - Part 1</w:t>
-            </w:r>
-          </w:p>
-          <w:p>
-            <w:pPr>
-              <w:jc w:val="center"/>
-            </w:pPr>
-            <w:r>
-              <w:rPr>
-                <w:rFonts w:ascii="Calibri" w:hAnsi="Calibri"/>
-                <w:i/>
-                <w:color w:val="595959"/>
-                <w:sz w:val="20"/>
-              </w:rPr>
-              <w:t>Delete this placeholder text and insert the corresponding screenshot here.</w:t>
-            </w:r>
-          </w:p>
-        </w:tc>
-      </w:tr>
-    </w:tbl>
-    <w:p>
-      <w:r>
-        <w:br w:type="page"/>
-      </w:r>
-    </w:p>
-    <w:p>
-      <w:pPr>
-        <w:pStyle w:val="3"/>
-        <w:keepNext/>
-      </w:pPr>
-      <w:r>
-        <w:t>8.5 Main.java (Part 2)</w:t>
-      </w:r>
-    </w:p>
-    <w:tbl>
-      <w:tblPr>
-        <w:tblW w:type="auto" w:w="0"/>
-        <w:jc w:val="center"/>
-        <w:tblLayout w:type="fixed"/>
-        <w:tblLook w:firstColumn="1" w:firstRow="1" w:lastColumn="0" w:lastRow="0" w:noHBand="0" w:noVBand="1" w:val="04A0"/>
-      </w:tblPr>
-      <w:tblGrid>
-        <w:gridCol w:w="9144"/>
-      </w:tblGrid>
-      <w:tr>
-        <w:trPr>
-          <w:trHeight w:val="8640" w:hRule="atLeast"/>
-        </w:trPr>
-        <w:tc>
-          <w:tcPr>
-            <w:tcW w:type="dxa" w:w="9144"/>
-            <w:vAlign w:val="center"/>
-            <w:tcMar>
-              <w:top w:w="140" w:type="dxa"/>
-              <w:start w:w="180" w:type="dxa"/>
-              <w:bottom w:w="140" w:type="dxa"/>
-              <w:end w:w="180" w:type="dxa"/>
-            </w:tcMar>
-            <w:shd w:fill="F7F9FC"/>
-            <w:tcBorders>
-              <w:top w:val="dashed" w:sz="10" w:space="0" w:color="9FBAD0"/>
-              <w:left w:val="dashed" w:sz="10" w:space="0" w:color="9FBAD0"/>
-              <w:bottom w:val="dashed" w:sz="10" w:space="0" w:color="9FBAD0"/>
-              <w:right w:val="dashed" w:sz="10" w:space="0" w:color="9FBAD0"/>
-            </w:tcBorders>
-          </w:tcPr>
-          <w:p>
-            <w:pPr>
-              <w:jc w:val="center"/>
-            </w:pPr>
-            <w:r>
-              <w:rPr>
-                <w:rFonts w:ascii="Calibri" w:hAnsi="Calibri"/>
-                <w:b/>
-                <w:color w:val="2E74B5"/>
-                <w:sz w:val="24"/>
-              </w:rPr>
-              <w:t>SOURCE CODE SCREENSHOT: Main.java - Part 2</w:t>
-            </w:r>
-          </w:p>
-          <w:p>
-            <w:pPr>
-              <w:jc w:val="center"/>
-            </w:pPr>
-            <w:r>
-              <w:rPr>
-                <w:rFonts w:ascii="Calibri" w:hAnsi="Calibri"/>
-                <w:i/>
-                <w:color w:val="595959"/>
-                <w:sz w:val="20"/>
-              </w:rPr>
-              <w:t>Delete this placeholder text and insert the corresponding screenshot here.</w:t>
-            </w:r>
-          </w:p>
-        </w:tc>
-      </w:tr>
-    </w:tbl>
     <w:sectPr>
       <w:pgSz w:w="12240" w:h="15840"/>
       <w:pgMar w:top="1440" w:right="1440" w:bottom="1440" w:left="1440" w:header="708" w:footer="708" w:gutter="0"/>

</xml_diff>